<commit_message>
completed the solution for Stub userRepository
</commit_message>
<xml_diff>
--- a/Labs/EG 01-Testing and SDLC - C#.docx
+++ b/Labs/EG 01-Testing and SDLC - C#.docx
@@ -330,9 +330,11 @@
             <w:tcW w:w="1379" w:type="dxa"/>
           </w:tcPr>
           <w:p>
+            <w:proofErr w:type="spellStart"/>
             <w:r>
               <w:t>UserService</w:t>
             </w:r>
+            <w:proofErr w:type="spellEnd"/>
           </w:p>
         </w:tc>
         <w:tc>
@@ -340,9 +342,14 @@
             <w:tcW w:w="1426" w:type="dxa"/>
           </w:tcPr>
           <w:p>
+            <w:proofErr w:type="spellStart"/>
             <w:r>
-              <w:t>registerUser</w:t>
+              <w:t>R</w:t>
             </w:r>
+            <w:r>
+              <w:t>egisterUser</w:t>
+            </w:r>
+            <w:proofErr w:type="spellEnd"/>
           </w:p>
         </w:tc>
         <w:tc>
@@ -382,9 +389,11 @@
             <w:tcW w:w="1379" w:type="dxa"/>
           </w:tcPr>
           <w:p>
+            <w:proofErr w:type="spellStart"/>
             <w:r>
               <w:t>UserService</w:t>
             </w:r>
+            <w:proofErr w:type="spellEnd"/>
           </w:p>
         </w:tc>
         <w:tc>
@@ -392,9 +401,14 @@
             <w:tcW w:w="1426" w:type="dxa"/>
           </w:tcPr>
           <w:p>
+            <w:proofErr w:type="spellStart"/>
             <w:r>
-              <w:t>registerUser</w:t>
+              <w:t>R</w:t>
             </w:r>
+            <w:r>
+              <w:t>egisterUser</w:t>
+            </w:r>
+            <w:proofErr w:type="spellEnd"/>
           </w:p>
         </w:tc>
         <w:tc>
@@ -413,7 +427,15 @@
           </w:tcPr>
           <w:p>
             <w:r>
-              <w:t>Throws ArgumentException with "Username already exists"</w:t>
+              <w:t xml:space="preserve">Throws </w:t>
+            </w:r>
+            <w:proofErr w:type="spellStart"/>
+            <w:r>
+              <w:t>ArgumentException</w:t>
+            </w:r>
+            <w:proofErr w:type="spellEnd"/>
+            <w:r>
+              <w:t xml:space="preserve"> with "Username already exists"</w:t>
             </w:r>
           </w:p>
         </w:tc>
@@ -573,8 +595,13 @@
         <w:t>C#</w:t>
       </w:r>
       <w:r>
-        <w:t xml:space="preserve"> UserService</w:t>
-      </w:r>
+        <w:t xml:space="preserve"> </w:t>
+      </w:r>
+      <w:proofErr w:type="spellStart"/>
+      <w:r>
+        <w:t>UserService</w:t>
+      </w:r>
+      <w:proofErr w:type="spellEnd"/>
     </w:p>
     <w:p>
       <w:pPr>
@@ -697,6 +724,7 @@
         </w:rPr>
         <w:t xml:space="preserve"> </w:t>
       </w:r>
+      <w:proofErr w:type="spellStart"/>
       <w:r>
         <w:rPr>
           <w:rFonts w:ascii="Consolas" w:hAnsi="Consolas" w:cs="Consolas"/>
@@ -709,6 +737,7 @@
         </w:rPr>
         <w:t>UserService</w:t>
       </w:r>
+      <w:proofErr w:type="spellEnd"/>
     </w:p>
     <w:p>
       <w:pPr>
@@ -931,6 +960,7 @@
         </w:rPr>
         <w:t xml:space="preserve"> </w:t>
       </w:r>
+      <w:proofErr w:type="spellStart"/>
       <w:r>
         <w:rPr>
           <w:rFonts w:ascii="Consolas" w:hAnsi="Consolas" w:cs="Consolas"/>
@@ -953,7 +983,20 @@
           <w:szCs w:val="19"/>
           <w:lang w:eastAsia="en-US"/>
         </w:rPr>
-        <w:t>egisterUser(String username, String password, String role)</w:t>
+        <w:t>egisterUser</w:t>
+      </w:r>
+      <w:proofErr w:type="spellEnd"/>
+      <w:r>
+        <w:rPr>
+          <w:rFonts w:ascii="Consolas" w:hAnsi="Consolas" w:cs="Consolas"/>
+          <w:b/>
+          <w:bCs/>
+          <w:color w:val="000000"/>
+          <w:sz w:val="19"/>
+          <w:szCs w:val="19"/>
+          <w:lang w:eastAsia="en-US"/>
+        </w:rPr>
+        <w:t>(String username, String password, String role)</w:t>
       </w:r>
     </w:p>
     <w:p>
@@ -1015,6 +1058,7 @@
         </w:rPr>
         <w:t xml:space="preserve"> throw </w:t>
       </w:r>
+      <w:proofErr w:type="spellStart"/>
       <w:r>
         <w:rPr>
           <w:rFonts w:ascii="Consolas" w:hAnsi="Consolas" w:cs="Consolas"/>
@@ -1023,7 +1067,18 @@
           <w:szCs w:val="19"/>
           <w:lang w:eastAsia="en-US"/>
         </w:rPr>
-        <w:t xml:space="preserve">IllegalArgumentException </w:t>
+        <w:t>ArgumentException</w:t>
+      </w:r>
+      <w:proofErr w:type="spellEnd"/>
+      <w:r>
+        <w:rPr>
+          <w:rFonts w:ascii="Consolas" w:hAnsi="Consolas" w:cs="Consolas"/>
+          <w:color w:val="77206D" w:themeColor="accent5" w:themeShade="BF"/>
+          <w:sz w:val="19"/>
+          <w:szCs w:val="19"/>
+          <w:lang w:eastAsia="en-US"/>
+        </w:rPr>
+        <w:t xml:space="preserve"> </w:t>
       </w:r>
       <w:r>
         <w:rPr>
@@ -1425,6 +1480,7 @@
         </w:rPr>
         <w:tab/>
       </w:r>
+      <w:proofErr w:type="spellStart"/>
       <w:r>
         <w:rPr>
           <w:rFonts w:ascii="Consolas" w:hAnsi="Consolas" w:cs="Consolas"/>
@@ -1449,6 +1505,7 @@
         </w:rPr>
         <w:t>Add</w:t>
       </w:r>
+      <w:proofErr w:type="spellEnd"/>
       <w:r>
         <w:rPr>
           <w:rFonts w:ascii="Consolas" w:hAnsi="Consolas" w:cs="Consolas"/>
@@ -1648,6 +1705,7 @@
         </w:rPr>
         <w:t xml:space="preserve"> bool </w:t>
       </w:r>
+      <w:proofErr w:type="spellStart"/>
       <w:r>
         <w:rPr>
           <w:rFonts w:ascii="Consolas" w:hAnsi="Consolas" w:cs="Consolas"/>
@@ -1670,7 +1728,20 @@
           <w:szCs w:val="19"/>
           <w:lang w:eastAsia="en-US"/>
         </w:rPr>
-        <w:t>oginUser(</w:t>
+        <w:t>oginUser</w:t>
+      </w:r>
+      <w:proofErr w:type="spellEnd"/>
+      <w:r>
+        <w:rPr>
+          <w:rFonts w:ascii="Consolas" w:hAnsi="Consolas" w:cs="Consolas"/>
+          <w:b/>
+          <w:bCs/>
+          <w:color w:val="000000"/>
+          <w:sz w:val="19"/>
+          <w:szCs w:val="19"/>
+          <w:lang w:eastAsia="en-US"/>
+        </w:rPr>
+        <w:t>(</w:t>
       </w:r>
       <w:r>
         <w:rPr>
@@ -1783,6 +1854,7 @@
         </w:rPr>
         <w:t xml:space="preserve"> throw </w:t>
       </w:r>
+      <w:proofErr w:type="spellStart"/>
       <w:r>
         <w:rPr>
           <w:rFonts w:ascii="Consolas" w:hAnsi="Consolas" w:cs="Consolas"/>
@@ -1791,7 +1863,18 @@
           <w:szCs w:val="19"/>
           <w:lang w:eastAsia="en-US"/>
         </w:rPr>
-        <w:t xml:space="preserve">ArgumentException </w:t>
+        <w:t>ArgumentException</w:t>
+      </w:r>
+      <w:proofErr w:type="spellEnd"/>
+      <w:r>
+        <w:rPr>
+          <w:rFonts w:ascii="Consolas" w:hAnsi="Consolas" w:cs="Consolas"/>
+          <w:color w:val="77206D" w:themeColor="accent5" w:themeShade="BF"/>
+          <w:sz w:val="19"/>
+          <w:szCs w:val="19"/>
+          <w:lang w:eastAsia="en-US"/>
+        </w:rPr>
+        <w:t xml:space="preserve"> </w:t>
       </w:r>
       <w:r>
         <w:rPr>
@@ -2168,6 +2251,7 @@
         </w:rPr>
         <w:t xml:space="preserve"> bool </w:t>
       </w:r>
+      <w:proofErr w:type="spellStart"/>
       <w:r>
         <w:rPr>
           <w:rFonts w:ascii="Consolas" w:hAnsi="Consolas" w:cs="Consolas"/>
@@ -2190,7 +2274,20 @@
           <w:szCs w:val="19"/>
           <w:lang w:eastAsia="en-US"/>
         </w:rPr>
-        <w:t>asAccess(</w:t>
+        <w:t>asAccess</w:t>
+      </w:r>
+      <w:proofErr w:type="spellEnd"/>
+      <w:r>
+        <w:rPr>
+          <w:rFonts w:ascii="Consolas" w:hAnsi="Consolas" w:cs="Consolas"/>
+          <w:b/>
+          <w:bCs/>
+          <w:color w:val="000000"/>
+          <w:sz w:val="19"/>
+          <w:szCs w:val="19"/>
+          <w:lang w:eastAsia="en-US"/>
+        </w:rPr>
+        <w:t>(</w:t>
       </w:r>
       <w:r>
         <w:rPr>
@@ -2238,7 +2335,33 @@
           <w:szCs w:val="19"/>
           <w:lang w:eastAsia="en-US"/>
         </w:rPr>
-        <w:t>tring requiredRole)</w:t>
+        <w:t xml:space="preserve">tring </w:t>
+      </w:r>
+      <w:proofErr w:type="spellStart"/>
+      <w:r>
+        <w:rPr>
+          <w:rFonts w:ascii="Consolas" w:hAnsi="Consolas" w:cs="Consolas"/>
+          <w:b/>
+          <w:bCs/>
+          <w:color w:val="000000"/>
+          <w:sz w:val="19"/>
+          <w:szCs w:val="19"/>
+          <w:lang w:eastAsia="en-US"/>
+        </w:rPr>
+        <w:t>requiredRole</w:t>
+      </w:r>
+      <w:proofErr w:type="spellEnd"/>
+      <w:r>
+        <w:rPr>
+          <w:rFonts w:ascii="Consolas" w:hAnsi="Consolas" w:cs="Consolas"/>
+          <w:b/>
+          <w:bCs/>
+          <w:color w:val="000000"/>
+          <w:sz w:val="19"/>
+          <w:szCs w:val="19"/>
+          <w:lang w:eastAsia="en-US"/>
+        </w:rPr>
+        <w:t>)</w:t>
       </w:r>
     </w:p>
     <w:p>
@@ -2300,6 +2423,7 @@
         </w:rPr>
         <w:t xml:space="preserve">// throw </w:t>
       </w:r>
+      <w:proofErr w:type="spellStart"/>
       <w:r>
         <w:rPr>
           <w:rFonts w:ascii="Consolas" w:hAnsi="Consolas" w:cs="Consolas"/>
@@ -2308,7 +2432,18 @@
           <w:szCs w:val="19"/>
           <w:lang w:eastAsia="en-US"/>
         </w:rPr>
-        <w:t xml:space="preserve">ArgumentException </w:t>
+        <w:t>ArgumentException</w:t>
+      </w:r>
+      <w:proofErr w:type="spellEnd"/>
+      <w:r>
+        <w:rPr>
+          <w:rFonts w:ascii="Consolas" w:hAnsi="Consolas" w:cs="Consolas"/>
+          <w:color w:val="77206D" w:themeColor="accent5" w:themeShade="BF"/>
+          <w:sz w:val="19"/>
+          <w:szCs w:val="19"/>
+          <w:lang w:eastAsia="en-US"/>
+        </w:rPr>
+        <w:t xml:space="preserve"> </w:t>
       </w:r>
       <w:r>
         <w:rPr>
@@ -2346,8 +2481,20 @@
           <w:szCs w:val="19"/>
           <w:lang w:eastAsia="en-US"/>
         </w:rPr>
-        <w:t xml:space="preserve"> // return true if the user’s role matches the requiredRole</w:t>
-      </w:r>
+        <w:t xml:space="preserve"> // return true if the user’s role matches the </w:t>
+      </w:r>
+      <w:proofErr w:type="spellStart"/>
+      <w:r>
+        <w:rPr>
+          <w:rFonts w:ascii="Consolas" w:hAnsi="Consolas" w:cs="Consolas"/>
+          <w:color w:val="3A7C22" w:themeColor="accent6" w:themeShade="BF"/>
+          <w:sz w:val="19"/>
+          <w:szCs w:val="19"/>
+          <w:lang w:eastAsia="en-US"/>
+        </w:rPr>
+        <w:t>requiredRole</w:t>
+      </w:r>
+      <w:proofErr w:type="spellEnd"/>
     </w:p>
     <w:p>
       <w:pPr>

</xml_diff>